<commit_message>
adicionado numero da licao
</commit_message>
<xml_diff>
--- a/automato/SIS.docx
+++ b/automato/SIS.docx
@@ -236,7 +236,6 @@
         <w:tc>
           <w:tcPr>
             <w:tcW w:w="2790" w:type="dxa"/>
-            <w:vMerge w:val="restart"/>
             <w:tcBorders>
               <w:top w:val="single" w:sz="6" w:space="0" w:color="4F81BD"/>
               <w:left w:val="single" w:sz="6" w:space="0" w:color="4F81BD"/>
@@ -267,15 +266,16 @@
               </w:rPr>
               <w:t>Sigla:</w:t>
             </w:r>
-          </w:p>
-          <w:p>
-            <w:pPr>
-              <w:jc w:val="center"/>
-              <w:rPr>
-                <w:sz w:val="28"/>
-                <w:szCs w:val="28"/>
-              </w:rPr>
-            </w:pPr>
+            <w:r>
+              <w:rPr>
+                <w:rFonts w:ascii="Arial" w:eastAsia="Arial" w:hAnsi="Arial" w:cs="Arial"/>
+                <w:b/>
+                <w:bCs/>
+                <w:sz w:val="24"/>
+                <w:szCs w:val="24"/>
+              </w:rPr>
+              <w:t xml:space="preserve"> </w:t>
+            </w:r>
             <w:r>
               <w:rPr>
                 <w:rFonts w:ascii="Arial" w:eastAsia="Arial" w:hAnsi="Arial" w:cs="Arial"/>
@@ -383,7 +383,6 @@
         <w:tc>
           <w:tcPr>
             <w:tcW w:w="2790" w:type="dxa"/>
-            <w:vMerge/>
             <w:tcBorders>
               <w:top w:val="single" w:sz="6" w:space="0" w:color="4F81BD"/>
               <w:left w:val="single" w:sz="6" w:space="0" w:color="4F81BD"/>
@@ -404,14 +403,25 @@
                 <w:between w:val="nil"/>
               </w:pBdr>
               <w:spacing w:line="276" w:lineRule="auto"/>
-              <w:rPr>
-                <w:rFonts w:ascii="Arial" w:eastAsia="Arial" w:hAnsi="Arial" w:cs="Arial"/>
-                <w:b/>
-                <w:bCs/>
-                <w:sz w:val="24"/>
-                <w:szCs w:val="24"/>
-              </w:rPr>
-            </w:pPr>
+              <w:jc w:val="center"/>
+              <w:rPr>
+                <w:rFonts w:ascii="Arial" w:eastAsia="Arial" w:hAnsi="Arial" w:cs="Arial"/>
+                <w:b/>
+                <w:bCs/>
+                <w:sz w:val="24"/>
+                <w:szCs w:val="24"/>
+              </w:rPr>
+            </w:pPr>
+            <w:r>
+              <w:rPr>
+                <w:rFonts w:ascii="Arial" w:eastAsia="Arial" w:hAnsi="Arial" w:cs="Arial"/>
+                <w:b/>
+                <w:bCs/>
+                <w:sz w:val="24"/>
+                <w:szCs w:val="24"/>
+              </w:rPr>
+              <w:t>Número lição: 1</w:t>
+            </w:r>
           </w:p>
         </w:tc>
         <w:tc>
@@ -495,7 +505,6 @@
         <w:tc>
           <w:tcPr>
             <w:tcW w:w="2790" w:type="dxa"/>
-            <w:vMerge/>
             <w:tcBorders>
               <w:top w:val="single" w:sz="6" w:space="0" w:color="4F81BD"/>
               <w:left w:val="single" w:sz="6" w:space="0" w:color="4F81BD"/>
@@ -516,6 +525,7 @@
                 <w:between w:val="nil"/>
               </w:pBdr>
               <w:spacing w:line="276" w:lineRule="auto"/>
+              <w:jc w:val="center"/>
               <w:rPr>
                 <w:rFonts w:ascii="Arial" w:eastAsia="Arial" w:hAnsi="Arial" w:cs="Arial"/>
                 <w:sz w:val="24"/>
@@ -695,17 +705,7 @@
                 <w:sz w:val="24"/>
                 <w:szCs w:val="24"/>
               </w:rPr>
-              <w:t xml:space="preserve">Tópico </w:t>
-            </w:r>
-            <w:r>
-              <w:rPr>
-                <w:rFonts w:ascii="Arial" w:eastAsia="Arial" w:hAnsi="Arial" w:cs="Arial"/>
-                <w:b/>
-                <w:bCs/>
-                <w:sz w:val="24"/>
-                <w:szCs w:val="24"/>
-              </w:rPr>
-              <w:t>0</w:t>
+              <w:t>Tópico 0</w:t>
             </w:r>
           </w:p>
         </w:tc>
@@ -4023,17 +4023,7 @@
                 <w:sz w:val="24"/>
                 <w:szCs w:val="24"/>
               </w:rPr>
-              <w:t xml:space="preserve">Tópico </w:t>
-            </w:r>
-            <w:r>
-              <w:rPr>
-                <w:rFonts w:ascii="Arial" w:eastAsia="Arial" w:hAnsi="Arial" w:cs="Arial"/>
-                <w:b/>
-                <w:bCs/>
-                <w:sz w:val="24"/>
-                <w:szCs w:val="24"/>
-              </w:rPr>
-              <w:t>2</w:t>
+              <w:t>Tópico 2</w:t>
             </w:r>
           </w:p>
         </w:tc>

</xml_diff>

<commit_message>
ajustes de caminho das imagens
</commit_message>
<xml_diff>
--- a/automato/SIS.docx
+++ b/automato/SIS.docx
@@ -922,29 +922,7 @@
                 <w:sz w:val="24"/>
                 <w:szCs w:val="24"/>
               </w:rPr>
-              <w:t>APRESENTA</w:t>
-            </w:r>
-            <w:r>
-              <w:rPr>
-                <w:rFonts w:ascii="Arial" w:eastAsia="Arial" w:hAnsi="Arial" w:cs="Arial"/>
-                <w:b/>
-                <w:bCs/>
-                <w:color w:val="EE0000"/>
-                <w:sz w:val="24"/>
-                <w:szCs w:val="24"/>
-              </w:rPr>
-              <w:t>CA</w:t>
-            </w:r>
-            <w:r>
-              <w:rPr>
-                <w:rFonts w:ascii="Arial" w:eastAsia="Arial" w:hAnsi="Arial" w:cs="Arial"/>
-                <w:b/>
-                <w:bCs/>
-                <w:color w:val="EE0000"/>
-                <w:sz w:val="24"/>
-                <w:szCs w:val="24"/>
-              </w:rPr>
-              <w:t>O</w:t>
+              <w:t>vando</w:t>
             </w:r>
             <w:r>
               <w:rPr>
@@ -2111,7 +2089,40 @@
                 <w:sz w:val="24"/>
                 <w:szCs w:val="24"/>
               </w:rPr>
-              <w:t>texto</w:t>
+              <w:t xml:space="preserve"> </w:t>
+            </w:r>
+            <w:r>
+              <w:rPr>
+                <w:rFonts w:ascii="Arial" w:eastAsia="Arial" w:hAnsi="Arial" w:cs="Arial"/>
+                <w:b/>
+                <w:bCs/>
+                <w:color w:val="EE0000"/>
+                <w:sz w:val="24"/>
+                <w:szCs w:val="24"/>
+              </w:rPr>
+              <w:t>TEXTO</w:t>
+            </w:r>
+            <w:r>
+              <w:rPr>
+                <w:rFonts w:ascii="Arial" w:eastAsia="Arial" w:hAnsi="Arial" w:cs="Arial"/>
+                <w:b/>
+                <w:bCs/>
+                <w:color w:val="EE0000"/>
+                <w:sz w:val="24"/>
+                <w:szCs w:val="24"/>
+              </w:rPr>
+              <w:t>COMIMAGEM</w:t>
+            </w:r>
+            <w:r>
+              <w:rPr>
+                <w:rFonts w:ascii="Arial" w:eastAsia="Arial" w:hAnsi="Arial" w:cs="Arial"/>
+                <w:b/>
+                <w:bCs/>
+                <w:color w:val="EE0000"/>
+                <w:sz w:val="24"/>
+                <w:szCs w:val="24"/>
+              </w:rPr>
+              <w:t xml:space="preserve"> </w:t>
             </w:r>
             <w:r>
               <w:rPr>
@@ -2967,15 +2978,7 @@
                 <w:sz w:val="26"/>
                 <w:szCs w:val="26"/>
               </w:rPr>
-              <w:t xml:space="preserve">Tópico </w:t>
-            </w:r>
-            <w:r>
-              <w:rPr>
-                <w:rFonts w:ascii="Arial" w:hAnsi="Arial" w:cs="Arial"/>
-                <w:sz w:val="26"/>
-                <w:szCs w:val="26"/>
-              </w:rPr>
-              <w:t>2</w:t>
+              <w:t>Tópico 2</w:t>
             </w:r>
           </w:p>
           <w:p/>
@@ -4248,15 +4251,7 @@
                 <w:sz w:val="26"/>
                 <w:szCs w:val="26"/>
               </w:rPr>
-              <w:t xml:space="preserve">Tópico </w:t>
-            </w:r>
-            <w:r>
-              <w:rPr>
-                <w:rFonts w:ascii="Arial" w:hAnsi="Arial" w:cs="Arial"/>
-                <w:sz w:val="26"/>
-                <w:szCs w:val="26"/>
-              </w:rPr>
-              <w:t>3</w:t>
+              <w:t>Tópico 3</w:t>
             </w:r>
           </w:p>
           <w:p>

</xml_diff>

<commit_message>
ajustes na criacao do wbtjson
</commit_message>
<xml_diff>
--- a/automato/SIS.docx
+++ b/automato/SIS.docx
@@ -918,6 +918,16 @@
                 <w:szCs w:val="24"/>
               </w:rPr>
               <w:t>Objetivos</w:t>
+            </w:r>
+            <w:r>
+              <w:rPr>
+                <w:rFonts w:ascii="Arial" w:eastAsia="Arial" w:hAnsi="Arial" w:cs="Arial"/>
+                <w:b/>
+                <w:bCs/>
+                <w:sz w:val="24"/>
+                <w:szCs w:val="24"/>
+              </w:rPr>
+              <w:t xml:space="preserve"> 2</w:t>
             </w:r>
           </w:p>
         </w:tc>

</xml_diff>

<commit_message>
Criacao funciona por sigla
</commit_message>
<xml_diff>
--- a/automato/SIS.docx
+++ b/automato/SIS.docx
@@ -410,7 +410,17 @@
                 <w:sz w:val="24"/>
                 <w:szCs w:val="24"/>
               </w:rPr>
-              <w:t>SIS</w:t>
+              <w:t>AB</w:t>
+            </w:r>
+            <w:r>
+              <w:rPr>
+                <w:rFonts w:ascii="Arial" w:eastAsia="Arial" w:hAnsi="Arial" w:cs="Arial"/>
+                <w:b/>
+                <w:bCs/>
+                <w:sz w:val="24"/>
+                <w:szCs w:val="24"/>
+              </w:rPr>
+              <w:t>B</w:t>
             </w:r>
           </w:p>
         </w:tc>
@@ -590,7 +600,7 @@
                 <w:sz w:val="24"/>
                 <w:szCs w:val="24"/>
               </w:rPr>
-              <w:t>1</w:t>
+              <w:t>2</w:t>
             </w:r>
           </w:p>
         </w:tc>

</xml_diff>